<commit_message>
bug fixes docs update
</commit_message>
<xml_diff>
--- a/FINAL DOCUMENTATION/Tool_Overview_OnePage.docx
+++ b/FINAL DOCUMENTATION/Tool_Overview_OnePage.docx
@@ -602,7 +602,7 @@
           <w:sz w:val="22"/>
           <w:szCs w:val="22"/>
         </w:rPr>
-        <w:t xml:space="preserve"> with lesson plans, the economics behind each control, and FAQs.</w:t>
+        <w:t xml:space="preserve"> with everything you need to get started.</w:t>
       </w:r>
     </w:p>
     <w:p>
@@ -640,7 +640,7 @@
           <w:sz w:val="22"/>
           <w:szCs w:val="22"/>
         </w:rPr>
-        <w:t xml:space="preserve"> documenting every equation and its calibration, for transparency with colleagues and examiners.</w:t>
+        <w:t xml:space="preserve"> documenting every equation and its calibration, built to closely match Blanchard’s textbook, for transparency with colleagues and examiners.</w:t>
       </w:r>
     </w:p>
     <w:p>

</xml_diff>